<commit_message>
docs(manuscript): re-sync LaTeX master and blind copy with the submitted Word text
Port the neutral framing, narrowed claims, corrected flow-through and placebo labels, conjecture-only policy section, sample-construction notes and new references into corridor.tex and the blind copy; refresh the reference bundle.

Co-Authored-By: Claude Sonnet 5.5 <noreply@anthropic.com>
</commit_message>
<xml_diff>
--- a/submission_eer_special_issue/declaration_of_interest.docx
+++ b/submission_eer_special_issue/declaration_of_interest.docx
@@ -219,47 +219,47 @@
       </w:r>
       <w:proofErr w:type="spellStart"/>
       <w:r>
-        <w:t xml:space="preserve">author</w:t>
-      </w:r>
-      <w:proofErr w:type="spellEnd"/>
-      <w:r>
-        <w:t xml:space="preserve"> </w:t>
-      </w:r>
-      <w:proofErr w:type="spellStart"/>
-      <w:r>
-        <w:t xml:space="preserve">is</w:t>
-      </w:r>
-      <w:proofErr w:type="spellEnd"/>
-      <w:r>
-        <w:t xml:space="preserve"> </w:t>
-      </w:r>
-      <w:proofErr w:type="spellStart"/>
-      <w:r>
-        <w:t xml:space="preserve">employed</w:t>
-      </w:r>
-      <w:proofErr w:type="spellEnd"/>
-      <w:r>
-        <w:t xml:space="preserve"> </w:t>
-      </w:r>
-      <w:proofErr w:type="spellStart"/>
-      <w:r>
-        <w:t xml:space="preserve">by</w:t>
-      </w:r>
-      <w:proofErr w:type="spellEnd"/>
-      <w:r>
-        <w:t xml:space="preserve"> </w:t>
-      </w:r>
-      <w:proofErr w:type="spellStart"/>
-      <w:r>
-        <w:t xml:space="preserve">the</w:t>
-      </w:r>
-      <w:proofErr w:type="spellEnd"/>
-      <w:r>
-        <w:t xml:space="preserve"> </w:t>
-      </w:r>
-      <w:proofErr w:type="spellStart"/>
-      <w:r>
-        <w:t xml:space="preserve">Astana</w:t>
+        <w:t>author</w:t>
+      </w:r>
+      <w:proofErr w:type="spellEnd"/>
+      <w:r>
+        <w:t xml:space="preserve"> </w:t>
+      </w:r>
+      <w:proofErr w:type="spellStart"/>
+      <w:r>
+        <w:t>is</w:t>
+      </w:r>
+      <w:proofErr w:type="spellEnd"/>
+      <w:r>
+        <w:t xml:space="preserve"> </w:t>
+      </w:r>
+      <w:proofErr w:type="spellStart"/>
+      <w:r>
+        <w:t>employed</w:t>
+      </w:r>
+      <w:proofErr w:type="spellEnd"/>
+      <w:r>
+        <w:t xml:space="preserve"> </w:t>
+      </w:r>
+      <w:proofErr w:type="spellStart"/>
+      <w:r>
+        <w:t>by</w:t>
+      </w:r>
+      <w:proofErr w:type="spellEnd"/>
+      <w:r>
+        <w:t xml:space="preserve"> </w:t>
+      </w:r>
+      <w:proofErr w:type="spellStart"/>
+      <w:r>
+        <w:t>the</w:t>
+      </w:r>
+      <w:proofErr w:type="spellEnd"/>
+      <w:r>
+        <w:t xml:space="preserve"> </w:t>
+      </w:r>
+      <w:proofErr w:type="spellStart"/>
+      <w:r>
+        <w:t>Astana</w:t>
       </w:r>
       <w:proofErr w:type="spellEnd"/>
       <w:r>
@@ -267,31 +267,31 @@
       </w:r>
       <w:proofErr w:type="spellStart"/>
       <w:r>
-        <w:t xml:space="preserve">which</w:t>
-      </w:r>
-      <w:proofErr w:type="spellEnd"/>
-      <w:r>
-        <w:t xml:space="preserve"> </w:t>
-      </w:r>
-      <w:proofErr w:type="spellStart"/>
-      <w:r>
-        <w:t xml:space="preserve">operates</w:t>
-      </w:r>
-      <w:proofErr w:type="spellEnd"/>
-      <w:r>
-        <w:t xml:space="preserve"> </w:t>
-      </w:r>
-      <w:proofErr w:type="spellStart"/>
-      <w:r>
-        <w:t xml:space="preserve">the</w:t>
-      </w:r>
-      <w:proofErr w:type="spellEnd"/>
-      <w:r>
-        <w:t xml:space="preserve"> </w:t>
-      </w:r>
-      <w:proofErr w:type="spellStart"/>
-      <w:r>
-        <w:t xml:space="preserve">Astana</w:t>
+        <w:t>which</w:t>
+      </w:r>
+      <w:proofErr w:type="spellEnd"/>
+      <w:r>
+        <w:t xml:space="preserve"> </w:t>
+      </w:r>
+      <w:proofErr w:type="spellStart"/>
+      <w:r>
+        <w:t>operates</w:t>
+      </w:r>
+      <w:proofErr w:type="spellEnd"/>
+      <w:r>
+        <w:t xml:space="preserve"> </w:t>
+      </w:r>
+      <w:proofErr w:type="spellStart"/>
+      <w:r>
+        <w:t>the</w:t>
+      </w:r>
+      <w:proofErr w:type="spellEnd"/>
+      <w:r>
+        <w:t xml:space="preserve"> </w:t>
+      </w:r>
+      <w:proofErr w:type="spellStart"/>
+      <w:r>
+        <w:t>Astana</w:t>
       </w:r>
       <w:proofErr w:type="spellEnd"/>
       <w:r>
@@ -299,71 +299,71 @@
       </w:r>
       <w:proofErr w:type="spellStart"/>
       <w:r>
-        <w:t xml:space="preserve">and</w:t>
-      </w:r>
-      <w:proofErr w:type="spellEnd"/>
-      <w:r>
-        <w:t xml:space="preserve"> </w:t>
-      </w:r>
-      <w:proofErr w:type="spellStart"/>
-      <w:r>
-        <w:t xml:space="preserve">is</w:t>
-      </w:r>
-      <w:proofErr w:type="spellEnd"/>
-      <w:r>
-        <w:t xml:space="preserve"> </w:t>
-      </w:r>
-      <w:proofErr w:type="spellStart"/>
-      <w:r>
-        <w:t xml:space="preserve">institutionally</w:t>
-      </w:r>
-      <w:proofErr w:type="spellEnd"/>
-      <w:r>
-        <w:t xml:space="preserve"> </w:t>
-      </w:r>
-      <w:proofErr w:type="spellStart"/>
-      <w:r>
-        <w:t xml:space="preserve">adjacent</w:t>
-      </w:r>
-      <w:proofErr w:type="spellEnd"/>
-      <w:r>
-        <w:t xml:space="preserve"> </w:t>
-      </w:r>
-      <w:proofErr w:type="spellStart"/>
-      <w:r>
-        <w:t xml:space="preserve">to</w:t>
-      </w:r>
-      <w:proofErr w:type="spellEnd"/>
-      <w:r>
-        <w:t xml:space="preserve"> </w:t>
-      </w:r>
-      <w:proofErr w:type="spellStart"/>
-      <w:r>
-        <w:t xml:space="preserve">Kazakhstan's</w:t>
-      </w:r>
-      <w:proofErr w:type="spellEnd"/>
-      <w:r>
-        <w:t xml:space="preserve"> </w:t>
-      </w:r>
-      <w:proofErr w:type="spellStart"/>
-      <w:r>
-        <w:t xml:space="preserve">state</w:t>
-      </w:r>
-      <w:proofErr w:type="spellEnd"/>
-      <w:r>
-        <w:t xml:space="preserve"> </w:t>
-      </w:r>
-      <w:proofErr w:type="spellStart"/>
-      <w:r>
-        <w:t xml:space="preserve">investment</w:t>
-      </w:r>
-      <w:proofErr w:type="spellEnd"/>
-      <w:r>
-        <w:t xml:space="preserve"> </w:t>
-      </w:r>
-      <w:proofErr w:type="spellStart"/>
-      <w:r>
-        <w:t xml:space="preserve">vehicles</w:t>
+        <w:t>and</w:t>
+      </w:r>
+      <w:proofErr w:type="spellEnd"/>
+      <w:r>
+        <w:t xml:space="preserve"> </w:t>
+      </w:r>
+      <w:proofErr w:type="spellStart"/>
+      <w:r>
+        <w:t>is</w:t>
+      </w:r>
+      <w:proofErr w:type="spellEnd"/>
+      <w:r>
+        <w:t xml:space="preserve"> </w:t>
+      </w:r>
+      <w:proofErr w:type="spellStart"/>
+      <w:r>
+        <w:t>institutionally</w:t>
+      </w:r>
+      <w:proofErr w:type="spellEnd"/>
+      <w:r>
+        <w:t xml:space="preserve"> </w:t>
+      </w:r>
+      <w:proofErr w:type="spellStart"/>
+      <w:r>
+        <w:t>adjacent</w:t>
+      </w:r>
+      <w:proofErr w:type="spellEnd"/>
+      <w:r>
+        <w:t xml:space="preserve"> </w:t>
+      </w:r>
+      <w:proofErr w:type="spellStart"/>
+      <w:r>
+        <w:t>to</w:t>
+      </w:r>
+      <w:proofErr w:type="spellEnd"/>
+      <w:r>
+        <w:t xml:space="preserve"> </w:t>
+      </w:r>
+      <w:proofErr w:type="spellStart"/>
+      <w:r>
+        <w:t>Kazakhstan's</w:t>
+      </w:r>
+      <w:proofErr w:type="spellEnd"/>
+      <w:r>
+        <w:t xml:space="preserve"> </w:t>
+      </w:r>
+      <w:proofErr w:type="spellStart"/>
+      <w:r>
+        <w:t>state</w:t>
+      </w:r>
+      <w:proofErr w:type="spellEnd"/>
+      <w:r>
+        <w:t xml:space="preserve"> </w:t>
+      </w:r>
+      <w:proofErr w:type="spellStart"/>
+      <w:r>
+        <w:t>investment</w:t>
+      </w:r>
+      <w:proofErr w:type="spellEnd"/>
+      <w:r>
+        <w:t xml:space="preserve"> </w:t>
+      </w:r>
+      <w:proofErr w:type="spellStart"/>
+      <w:r>
+        <w:t>vehicles</w:t>
       </w:r>
       <w:proofErr w:type="spellEnd"/>
       <w:r>
@@ -371,71 +371,71 @@
       </w:r>
       <w:proofErr w:type="spellStart"/>
       <w:r>
-        <w:t xml:space="preserve">This</w:t>
-      </w:r>
-      <w:proofErr w:type="spellEnd"/>
-      <w:r>
-        <w:t xml:space="preserve"> </w:t>
-      </w:r>
-      <w:proofErr w:type="spellStart"/>
-      <w:r>
-        <w:t xml:space="preserve">role</w:t>
-      </w:r>
-      <w:proofErr w:type="spellEnd"/>
-      <w:r>
-        <w:t xml:space="preserve"> </w:t>
-      </w:r>
-      <w:proofErr w:type="spellStart"/>
-      <w:r>
-        <w:t xml:space="preserve">is</w:t>
-      </w:r>
-      <w:proofErr w:type="spellEnd"/>
-      <w:r>
-        <w:t xml:space="preserve"> </w:t>
-      </w:r>
-      <w:proofErr w:type="spellStart"/>
-      <w:r>
-        <w:t xml:space="preserve">not</w:t>
-      </w:r>
-      <w:proofErr w:type="spellEnd"/>
-      <w:r>
-        <w:t xml:space="preserve"> </w:t>
-      </w:r>
-      <w:proofErr w:type="spellStart"/>
-      <w:r>
-        <w:t xml:space="preserve">used</w:t>
-      </w:r>
-      <w:proofErr w:type="spellEnd"/>
-      <w:r>
-        <w:t xml:space="preserve"> </w:t>
-      </w:r>
-      <w:proofErr w:type="spellStart"/>
-      <w:r>
-        <w:t xml:space="preserve">in</w:t>
-      </w:r>
-      <w:proofErr w:type="spellEnd"/>
-      <w:r>
-        <w:t xml:space="preserve"> </w:t>
-      </w:r>
-      <w:proofErr w:type="spellStart"/>
-      <w:r>
-        <w:t xml:space="preserve">the</w:t>
-      </w:r>
-      <w:proofErr w:type="spellEnd"/>
-      <w:r>
-        <w:t xml:space="preserve"> </w:t>
-      </w:r>
-      <w:proofErr w:type="spellStart"/>
-      <w:r>
-        <w:t xml:space="preserve">empirical</w:t>
-      </w:r>
-      <w:proofErr w:type="spellEnd"/>
-      <w:r>
-        <w:t xml:space="preserve"> </w:t>
-      </w:r>
-      <w:proofErr w:type="spellStart"/>
-      <w:r>
-        <w:t xml:space="preserve">analysis</w:t>
+        <w:t>This</w:t>
+      </w:r>
+      <w:proofErr w:type="spellEnd"/>
+      <w:r>
+        <w:t xml:space="preserve"> </w:t>
+      </w:r>
+      <w:proofErr w:type="spellStart"/>
+      <w:r>
+        <w:t>role</w:t>
+      </w:r>
+      <w:proofErr w:type="spellEnd"/>
+      <w:r>
+        <w:t xml:space="preserve"> </w:t>
+      </w:r>
+      <w:proofErr w:type="spellStart"/>
+      <w:r>
+        <w:t>is</w:t>
+      </w:r>
+      <w:proofErr w:type="spellEnd"/>
+      <w:r>
+        <w:t xml:space="preserve"> </w:t>
+      </w:r>
+      <w:proofErr w:type="spellStart"/>
+      <w:r>
+        <w:t>not</w:t>
+      </w:r>
+      <w:proofErr w:type="spellEnd"/>
+      <w:r>
+        <w:t xml:space="preserve"> </w:t>
+      </w:r>
+      <w:proofErr w:type="spellStart"/>
+      <w:r>
+        <w:t>used</w:t>
+      </w:r>
+      <w:proofErr w:type="spellEnd"/>
+      <w:r>
+        <w:t xml:space="preserve"> </w:t>
+      </w:r>
+      <w:proofErr w:type="spellStart"/>
+      <w:r>
+        <w:t>in</w:t>
+      </w:r>
+      <w:proofErr w:type="spellEnd"/>
+      <w:r>
+        <w:t xml:space="preserve"> </w:t>
+      </w:r>
+      <w:proofErr w:type="spellStart"/>
+      <w:r>
+        <w:t>the</w:t>
+      </w:r>
+      <w:proofErr w:type="spellEnd"/>
+      <w:r>
+        <w:t xml:space="preserve"> </w:t>
+      </w:r>
+      <w:proofErr w:type="spellStart"/>
+      <w:r>
+        <w:t>empirical</w:t>
+      </w:r>
+      <w:proofErr w:type="spellEnd"/>
+      <w:r>
+        <w:t xml:space="preserve"> </w:t>
+      </w:r>
+      <w:proofErr w:type="spellStart"/>
+      <w:r>
+        <w:t>analysis</w:t>
       </w:r>
       <w:proofErr w:type="spellEnd"/>
       <w:r>
@@ -443,143 +443,143 @@
       </w:r>
       <w:proofErr w:type="spellStart"/>
       <w:r>
-        <w:t xml:space="preserve">which</w:t>
-      </w:r>
-      <w:proofErr w:type="spellEnd"/>
-      <w:r>
-        <w:t xml:space="preserve"> </w:t>
-      </w:r>
-      <w:proofErr w:type="spellStart"/>
-      <w:r>
-        <w:t xml:space="preserve">is</w:t>
-      </w:r>
-      <w:proofErr w:type="spellEnd"/>
-      <w:r>
-        <w:t xml:space="preserve"> </w:t>
-      </w:r>
-      <w:proofErr w:type="spellStart"/>
-      <w:r>
-        <w:t xml:space="preserve">based</w:t>
-      </w:r>
-      <w:proofErr w:type="spellEnd"/>
-      <w:r>
-        <w:t xml:space="preserve"> </w:t>
-      </w:r>
-      <w:proofErr w:type="spellStart"/>
-      <w:r>
-        <w:t xml:space="preserve">on</w:t>
-      </w:r>
-      <w:proofErr w:type="spellEnd"/>
-      <w:r>
-        <w:t xml:space="preserve"> </w:t>
-      </w:r>
-      <w:proofErr w:type="spellStart"/>
-      <w:r>
-        <w:t xml:space="preserve">public</w:t>
-      </w:r>
-      <w:proofErr w:type="spellEnd"/>
-      <w:r>
-        <w:t xml:space="preserve"> </w:t>
-      </w:r>
-      <w:proofErr w:type="spellStart"/>
-      <w:r>
-        <w:t xml:space="preserve">data</w:t>
-      </w:r>
-      <w:proofErr w:type="spellEnd"/>
-      <w:r>
-        <w:t xml:space="preserve"> </w:t>
-      </w:r>
-      <w:proofErr w:type="spellStart"/>
-      <w:r>
-        <w:t xml:space="preserve">and</w:t>
-      </w:r>
-      <w:proofErr w:type="spellEnd"/>
-      <w:r>
-        <w:t xml:space="preserve"> </w:t>
-      </w:r>
-      <w:proofErr w:type="spellStart"/>
-      <w:r>
-        <w:t xml:space="preserve">on</w:t>
-      </w:r>
-      <w:proofErr w:type="spellEnd"/>
-      <w:r>
-        <w:t xml:space="preserve"> </w:t>
-      </w:r>
-      <w:proofErr w:type="spellStart"/>
-      <w:r>
-        <w:t xml:space="preserve">commercial</w:t>
-      </w:r>
-      <w:proofErr w:type="spellEnd"/>
-      <w:r>
-        <w:t xml:space="preserve"> </w:t>
-      </w:r>
-      <w:proofErr w:type="spellStart"/>
-      <w:r>
-        <w:t xml:space="preserve">deal</w:t>
-      </w:r>
-      <w:proofErr w:type="spellEnd"/>
-      <w:r>
-        <w:t xml:space="preserve"> </w:t>
-      </w:r>
-      <w:proofErr w:type="spellStart"/>
-      <w:r>
-        <w:t xml:space="preserve">databases</w:t>
-      </w:r>
-      <w:proofErr w:type="spellEnd"/>
-      <w:r>
-        <w:t xml:space="preserve"> </w:t>
-      </w:r>
-      <w:proofErr w:type="spellStart"/>
-      <w:r>
-        <w:t xml:space="preserve">to</w:t>
-      </w:r>
-      <w:proofErr w:type="spellEnd"/>
-      <w:r>
-        <w:t xml:space="preserve"> </w:t>
-      </w:r>
-      <w:proofErr w:type="spellStart"/>
-      <w:r>
-        <w:t xml:space="preserve">which</w:t>
-      </w:r>
-      <w:proofErr w:type="spellEnd"/>
-      <w:r>
-        <w:t xml:space="preserve"> </w:t>
-      </w:r>
-      <w:proofErr w:type="spellStart"/>
-      <w:r>
-        <w:t xml:space="preserve">the</w:t>
-      </w:r>
-      <w:proofErr w:type="spellEnd"/>
-      <w:r>
-        <w:t xml:space="preserve"> </w:t>
-      </w:r>
-      <w:proofErr w:type="spellStart"/>
-      <w:r>
-        <w:t xml:space="preserve">author</w:t>
-      </w:r>
-      <w:proofErr w:type="spellEnd"/>
-      <w:r>
-        <w:t xml:space="preserve"> </w:t>
-      </w:r>
-      <w:proofErr w:type="spellStart"/>
-      <w:r>
-        <w:t xml:space="preserve">has</w:t>
-      </w:r>
-      <w:proofErr w:type="spellEnd"/>
-      <w:r>
-        <w:t xml:space="preserve"> </w:t>
-      </w:r>
-      <w:proofErr w:type="spellStart"/>
-      <w:r>
-        <w:t xml:space="preserve">academic</w:t>
-      </w:r>
-      <w:proofErr w:type="spellEnd"/>
-      <w:r>
-        <w:t xml:space="preserve"> </w:t>
-      </w:r>
-      <w:proofErr w:type="spellStart"/>
-      <w:r>
-        <w:t xml:space="preserve">access</w:t>
+        <w:t>which</w:t>
+      </w:r>
+      <w:proofErr w:type="spellEnd"/>
+      <w:r>
+        <w:t xml:space="preserve"> </w:t>
+      </w:r>
+      <w:proofErr w:type="spellStart"/>
+      <w:r>
+        <w:t>is</w:t>
+      </w:r>
+      <w:proofErr w:type="spellEnd"/>
+      <w:r>
+        <w:t xml:space="preserve"> </w:t>
+      </w:r>
+      <w:proofErr w:type="spellStart"/>
+      <w:r>
+        <w:t>based</w:t>
+      </w:r>
+      <w:proofErr w:type="spellEnd"/>
+      <w:r>
+        <w:t xml:space="preserve"> </w:t>
+      </w:r>
+      <w:proofErr w:type="spellStart"/>
+      <w:r>
+        <w:t>on</w:t>
+      </w:r>
+      <w:proofErr w:type="spellEnd"/>
+      <w:r>
+        <w:t xml:space="preserve"> </w:t>
+      </w:r>
+      <w:proofErr w:type="spellStart"/>
+      <w:r>
+        <w:t>public</w:t>
+      </w:r>
+      <w:proofErr w:type="spellEnd"/>
+      <w:r>
+        <w:t xml:space="preserve"> </w:t>
+      </w:r>
+      <w:proofErr w:type="spellStart"/>
+      <w:r>
+        <w:t>data</w:t>
+      </w:r>
+      <w:proofErr w:type="spellEnd"/>
+      <w:r>
+        <w:t xml:space="preserve"> </w:t>
+      </w:r>
+      <w:proofErr w:type="spellStart"/>
+      <w:r>
+        <w:t>and</w:t>
+      </w:r>
+      <w:proofErr w:type="spellEnd"/>
+      <w:r>
+        <w:t xml:space="preserve"> </w:t>
+      </w:r>
+      <w:proofErr w:type="spellStart"/>
+      <w:r>
+        <w:t>on</w:t>
+      </w:r>
+      <w:proofErr w:type="spellEnd"/>
+      <w:r>
+        <w:t xml:space="preserve"> </w:t>
+      </w:r>
+      <w:proofErr w:type="spellStart"/>
+      <w:r>
+        <w:t>commercial</w:t>
+      </w:r>
+      <w:proofErr w:type="spellEnd"/>
+      <w:r>
+        <w:t xml:space="preserve"> </w:t>
+      </w:r>
+      <w:proofErr w:type="spellStart"/>
+      <w:r>
+        <w:t>deal</w:t>
+      </w:r>
+      <w:proofErr w:type="spellEnd"/>
+      <w:r>
+        <w:t xml:space="preserve"> </w:t>
+      </w:r>
+      <w:proofErr w:type="spellStart"/>
+      <w:r>
+        <w:t>databases</w:t>
+      </w:r>
+      <w:proofErr w:type="spellEnd"/>
+      <w:r>
+        <w:t xml:space="preserve"> </w:t>
+      </w:r>
+      <w:proofErr w:type="spellStart"/>
+      <w:r>
+        <w:t>to</w:t>
+      </w:r>
+      <w:proofErr w:type="spellEnd"/>
+      <w:r>
+        <w:t xml:space="preserve"> </w:t>
+      </w:r>
+      <w:proofErr w:type="spellStart"/>
+      <w:r>
+        <w:t>which</w:t>
+      </w:r>
+      <w:proofErr w:type="spellEnd"/>
+      <w:r>
+        <w:t xml:space="preserve"> </w:t>
+      </w:r>
+      <w:proofErr w:type="spellStart"/>
+      <w:r>
+        <w:t>the</w:t>
+      </w:r>
+      <w:proofErr w:type="spellEnd"/>
+      <w:r>
+        <w:t xml:space="preserve"> </w:t>
+      </w:r>
+      <w:proofErr w:type="spellStart"/>
+      <w:r>
+        <w:t>author</w:t>
+      </w:r>
+      <w:proofErr w:type="spellEnd"/>
+      <w:r>
+        <w:t xml:space="preserve"> </w:t>
+      </w:r>
+      <w:proofErr w:type="spellStart"/>
+      <w:r>
+        <w:t>has</w:t>
+      </w:r>
+      <w:proofErr w:type="spellEnd"/>
+      <w:r>
+        <w:t xml:space="preserve"> </w:t>
+      </w:r>
+      <w:proofErr w:type="spellStart"/>
+      <w:r>
+        <w:t>academic</w:t>
+      </w:r>
+      <w:proofErr w:type="spellEnd"/>
+      <w:r>
+        <w:t xml:space="preserve"> </w:t>
+      </w:r>
+      <w:proofErr w:type="spellStart"/>
+      <w:r>
+        <w:t>access</w:t>
       </w:r>
       <w:proofErr w:type="spellEnd"/>
       <w:r>
@@ -587,79 +587,79 @@
       </w:r>
       <w:proofErr w:type="spellStart"/>
       <w:r>
-        <w:t xml:space="preserve">manuscript</w:t>
-      </w:r>
-      <w:proofErr w:type="spellEnd"/>
-      <w:r>
-        <w:t xml:space="preserve"> </w:t>
-      </w:r>
-      <w:proofErr w:type="spellStart"/>
-      <w:r>
-        <w:t xml:space="preserve">offers conjectural investment-policy implications;</w:t>
-      </w:r>
-      <w:proofErr w:type="spellEnd"/>
-      <w:r>
-        <w:t xml:space="preserve"/>
-      </w:r>
-      <w:proofErr w:type="spellStart"/>
-      <w:r>
-        <w:t xml:space="preserve"/>
-      </w:r>
-      <w:proofErr w:type="spellEnd"/>
-      <w:r>
-        <w:t xml:space="preserve"/>
-      </w:r>
-      <w:proofErr w:type="spellStart"/>
-      <w:r>
-        <w:t xml:space="preserve"/>
-      </w:r>
-      <w:proofErr w:type="spellEnd"/>
-      <w:r>
-        <w:t xml:space="preserve"/>
-      </w:r>
-      <w:proofErr w:type="spellStart"/>
-      <w:r>
-        <w:t xml:space="preserve"/>
-      </w:r>
-      <w:proofErr w:type="spellEnd"/>
-      <w:r>
-        <w:t xml:space="preserve"> </w:t>
-      </w:r>
-      <w:proofErr w:type="spellStart"/>
-      <w:r>
-        <w:t xml:space="preserve">these</w:t>
-      </w:r>
-      <w:proofErr w:type="spellEnd"/>
-      <w:r>
-        <w:t xml:space="preserve"> </w:t>
-      </w:r>
-      <w:proofErr w:type="spellStart"/>
-      <w:r>
-        <w:t xml:space="preserve">are</w:t>
-      </w:r>
-      <w:proofErr w:type="spellEnd"/>
-      <w:r>
-        <w:t xml:space="preserve"> </w:t>
-      </w:r>
-      <w:proofErr w:type="spellStart"/>
-      <w:r>
-        <w:t xml:space="preserve">the</w:t>
-      </w:r>
-      <w:proofErr w:type="spellEnd"/>
-      <w:r>
-        <w:t xml:space="preserve"> </w:t>
-      </w:r>
-      <w:proofErr w:type="spellStart"/>
-      <w:r>
-        <w:t xml:space="preserve">author's</w:t>
-      </w:r>
-      <w:proofErr w:type="spellEnd"/>
-      <w:r>
-        <w:t xml:space="preserve"> </w:t>
-      </w:r>
-      <w:proofErr w:type="spellStart"/>
-      <w:r>
-        <w:t xml:space="preserve">own</w:t>
+        <w:t>manuscript</w:t>
+      </w:r>
+      <w:proofErr w:type="spellEnd"/>
+      <w:r>
+        <w:t xml:space="preserve"> </w:t>
+      </w:r>
+      <w:proofErr w:type="spellStart"/>
+      <w:r>
+        <w:t>offers</w:t>
+      </w:r>
+      <w:proofErr w:type="spellEnd"/>
+      <w:r>
+        <w:t xml:space="preserve"> </w:t>
+      </w:r>
+      <w:proofErr w:type="spellStart"/>
+      <w:r>
+        <w:t>conjectural</w:t>
+      </w:r>
+      <w:proofErr w:type="spellEnd"/>
+      <w:r>
+        <w:t xml:space="preserve"> </w:t>
+      </w:r>
+      <w:proofErr w:type="spellStart"/>
+      <w:r>
+        <w:t>investment-policy</w:t>
+      </w:r>
+      <w:proofErr w:type="spellEnd"/>
+      <w:r>
+        <w:t xml:space="preserve"> </w:t>
+      </w:r>
+      <w:proofErr w:type="spellStart"/>
+      <w:r>
+        <w:t>implications</w:t>
+      </w:r>
+      <w:proofErr w:type="spellEnd"/>
+      <w:r>
+        <w:t xml:space="preserve">; </w:t>
+      </w:r>
+      <w:proofErr w:type="spellStart"/>
+      <w:r>
+        <w:t>these</w:t>
+      </w:r>
+      <w:proofErr w:type="spellEnd"/>
+      <w:r>
+        <w:t xml:space="preserve"> </w:t>
+      </w:r>
+      <w:proofErr w:type="spellStart"/>
+      <w:r>
+        <w:t>are</w:t>
+      </w:r>
+      <w:proofErr w:type="spellEnd"/>
+      <w:r>
+        <w:t xml:space="preserve"> </w:t>
+      </w:r>
+      <w:proofErr w:type="spellStart"/>
+      <w:r>
+        <w:t>the</w:t>
+      </w:r>
+      <w:proofErr w:type="spellEnd"/>
+      <w:r>
+        <w:t xml:space="preserve"> </w:t>
+      </w:r>
+      <w:proofErr w:type="spellStart"/>
+      <w:r>
+        <w:t>author's</w:t>
+      </w:r>
+      <w:proofErr w:type="spellEnd"/>
+      <w:r>
+        <w:t xml:space="preserve"> </w:t>
+      </w:r>
+      <w:proofErr w:type="spellStart"/>
+      <w:r>
+        <w:t>own</w:t>
       </w:r>
       <w:proofErr w:type="spellEnd"/>
       <w:r>
@@ -667,47 +667,47 @@
       </w:r>
       <w:proofErr w:type="spellStart"/>
       <w:r>
-        <w:t xml:space="preserve">informed</w:t>
-      </w:r>
-      <w:proofErr w:type="spellEnd"/>
-      <w:r>
-        <w:t xml:space="preserve"> </w:t>
-      </w:r>
-      <w:proofErr w:type="spellStart"/>
-      <w:r>
-        <w:t xml:space="preserve">by</w:t>
-      </w:r>
-      <w:proofErr w:type="spellEnd"/>
-      <w:r>
-        <w:t xml:space="preserve"> </w:t>
-      </w:r>
-      <w:proofErr w:type="spellStart"/>
-      <w:r>
-        <w:t xml:space="preserve">but</w:t>
-      </w:r>
-      <w:proofErr w:type="spellEnd"/>
-      <w:r>
-        <w:t xml:space="preserve"> </w:t>
-      </w:r>
-      <w:proofErr w:type="spellStart"/>
-      <w:r>
-        <w:t xml:space="preserve">not</w:t>
-      </w:r>
-      <w:proofErr w:type="spellEnd"/>
-      <w:r>
-        <w:t xml:space="preserve"> </w:t>
-      </w:r>
-      <w:proofErr w:type="spellStart"/>
-      <w:r>
-        <w:t xml:space="preserve">representing</w:t>
-      </w:r>
-      <w:proofErr w:type="spellEnd"/>
-      <w:r>
-        <w:t xml:space="preserve"> </w:t>
-      </w:r>
-      <w:proofErr w:type="spellStart"/>
-      <w:r>
-        <w:t xml:space="preserve">the</w:t>
+        <w:t>informed</w:t>
+      </w:r>
+      <w:proofErr w:type="spellEnd"/>
+      <w:r>
+        <w:t xml:space="preserve"> </w:t>
+      </w:r>
+      <w:proofErr w:type="spellStart"/>
+      <w:r>
+        <w:t>by</w:t>
+      </w:r>
+      <w:proofErr w:type="spellEnd"/>
+      <w:r>
+        <w:t xml:space="preserve"> </w:t>
+      </w:r>
+      <w:proofErr w:type="spellStart"/>
+      <w:r>
+        <w:t>but</w:t>
+      </w:r>
+      <w:proofErr w:type="spellEnd"/>
+      <w:r>
+        <w:t xml:space="preserve"> </w:t>
+      </w:r>
+      <w:proofErr w:type="spellStart"/>
+      <w:r>
+        <w:t>not</w:t>
+      </w:r>
+      <w:proofErr w:type="spellEnd"/>
+      <w:r>
+        <w:t xml:space="preserve"> </w:t>
+      </w:r>
+      <w:proofErr w:type="spellStart"/>
+      <w:r>
+        <w:t>representing</w:t>
+      </w:r>
+      <w:proofErr w:type="spellEnd"/>
+      <w:r>
+        <w:t xml:space="preserve"> </w:t>
+      </w:r>
+      <w:proofErr w:type="spellStart"/>
+      <w:r>
+        <w:t>the</w:t>
       </w:r>
       <w:proofErr w:type="spellEnd"/>
       <w:r>
@@ -715,15 +715,15 @@
       </w:r>
       <w:proofErr w:type="spellStart"/>
       <w:r>
-        <w:t xml:space="preserve">the</w:t>
-      </w:r>
-      <w:proofErr w:type="spellEnd"/>
-      <w:r>
-        <w:t xml:space="preserve"> </w:t>
-      </w:r>
-      <w:proofErr w:type="spellStart"/>
-      <w:r>
-        <w:t xml:space="preserve">Qazaqstan</w:t>
+        <w:t>the</w:t>
+      </w:r>
+      <w:proofErr w:type="spellEnd"/>
+      <w:r>
+        <w:t xml:space="preserve"> </w:t>
+      </w:r>
+      <w:proofErr w:type="spellStart"/>
+      <w:r>
+        <w:t>Qazaqstan</w:t>
       </w:r>
       <w:proofErr w:type="spellEnd"/>
       <w:r>
@@ -731,15 +731,15 @@
       </w:r>
       <w:proofErr w:type="spellStart"/>
       <w:r>
-        <w:t xml:space="preserve">or</w:t>
-      </w:r>
-      <w:proofErr w:type="spellEnd"/>
-      <w:r>
-        <w:t xml:space="preserve"> </w:t>
-      </w:r>
-      <w:proofErr w:type="spellStart"/>
-      <w:r>
-        <w:t xml:space="preserve">the</w:t>
+        <w:t>or</w:t>
+      </w:r>
+      <w:proofErr w:type="spellEnd"/>
+      <w:r>
+        <w:t xml:space="preserve"> </w:t>
+      </w:r>
+      <w:proofErr w:type="spellStart"/>
+      <w:r>
+        <w:t>the</w:t>
       </w:r>
       <w:proofErr w:type="spellEnd"/>
       <w:r>
@@ -747,55 +747,55 @@
       </w:r>
       <w:proofErr w:type="spellStart"/>
       <w:r>
-        <w:t xml:space="preserve">state-fund</w:t>
-      </w:r>
-      <w:proofErr w:type="spellEnd"/>
-      <w:r>
-        <w:t xml:space="preserve"> </w:t>
-      </w:r>
-      <w:proofErr w:type="spellStart"/>
-      <w:r>
-        <w:t xml:space="preserve">investment</w:t>
-      </w:r>
-      <w:proofErr w:type="spellEnd"/>
-      <w:r>
-        <w:t xml:space="preserve"> </w:t>
-      </w:r>
-      <w:proofErr w:type="spellStart"/>
-      <w:r>
-        <w:t xml:space="preserve">figures</w:t>
-      </w:r>
-      <w:proofErr w:type="spellEnd"/>
-      <w:r>
-        <w:t xml:space="preserve"> </w:t>
-      </w:r>
-      <w:proofErr w:type="spellStart"/>
-      <w:r>
-        <w:t xml:space="preserve">cited</w:t>
-      </w:r>
-      <w:proofErr w:type="spellEnd"/>
-      <w:r>
-        <w:t xml:space="preserve"> </w:t>
-      </w:r>
-      <w:proofErr w:type="spellStart"/>
-      <w:r>
-        <w:t xml:space="preserve">are</w:t>
-      </w:r>
-      <w:proofErr w:type="spellEnd"/>
-      <w:r>
-        <w:t xml:space="preserve"> </w:t>
-      </w:r>
-      <w:proofErr w:type="spellStart"/>
-      <w:r>
-        <w:t xml:space="preserve">drawn</w:t>
-      </w:r>
-      <w:proofErr w:type="spellEnd"/>
-      <w:r>
-        <w:t xml:space="preserve"> </w:t>
-      </w:r>
-      <w:proofErr w:type="spellStart"/>
-      <w:r>
-        <w:t xml:space="preserve">from</w:t>
+        <w:t>state-fund</w:t>
+      </w:r>
+      <w:proofErr w:type="spellEnd"/>
+      <w:r>
+        <w:t xml:space="preserve"> </w:t>
+      </w:r>
+      <w:proofErr w:type="spellStart"/>
+      <w:r>
+        <w:t>investment</w:t>
+      </w:r>
+      <w:proofErr w:type="spellEnd"/>
+      <w:r>
+        <w:t xml:space="preserve"> </w:t>
+      </w:r>
+      <w:proofErr w:type="spellStart"/>
+      <w:r>
+        <w:t>figures</w:t>
+      </w:r>
+      <w:proofErr w:type="spellEnd"/>
+      <w:r>
+        <w:t xml:space="preserve"> </w:t>
+      </w:r>
+      <w:proofErr w:type="spellStart"/>
+      <w:r>
+        <w:t>cited</w:t>
+      </w:r>
+      <w:proofErr w:type="spellEnd"/>
+      <w:r>
+        <w:t xml:space="preserve"> </w:t>
+      </w:r>
+      <w:proofErr w:type="spellStart"/>
+      <w:r>
+        <w:t>are</w:t>
+      </w:r>
+      <w:proofErr w:type="spellEnd"/>
+      <w:r>
+        <w:t xml:space="preserve"> </w:t>
+      </w:r>
+      <w:proofErr w:type="spellStart"/>
+      <w:r>
+        <w:t>drawn</w:t>
+      </w:r>
+      <w:proofErr w:type="spellEnd"/>
+      <w:r>
+        <w:t xml:space="preserve"> </w:t>
+      </w:r>
+      <w:proofErr w:type="spellStart"/>
+      <w:r>
+        <w:t>from</w:t>
       </w:r>
       <w:proofErr w:type="spellEnd"/>
       <w:r>
@@ -803,31 +803,31 @@
       </w:r>
       <w:proofErr w:type="spellStart"/>
       <w:r>
-        <w:t xml:space="preserve">report</w:t>
-      </w:r>
-      <w:proofErr w:type="spellEnd"/>
-      <w:r>
-        <w:t xml:space="preserve"> </w:t>
-      </w:r>
-      <w:proofErr w:type="spellStart"/>
-      <w:r>
-        <w:t xml:space="preserve">co-published</w:t>
-      </w:r>
-      <w:proofErr w:type="spellEnd"/>
-      <w:r>
-        <w:t xml:space="preserve"> </w:t>
-      </w:r>
-      <w:proofErr w:type="spellStart"/>
-      <w:r>
-        <w:t xml:space="preserve">by</w:t>
-      </w:r>
-      <w:proofErr w:type="spellEnd"/>
-      <w:r>
-        <w:t xml:space="preserve"> </w:t>
-      </w:r>
-      <w:proofErr w:type="spellStart"/>
-      <w:r>
-        <w:t xml:space="preserve">the</w:t>
+        <w:t>report</w:t>
+      </w:r>
+      <w:proofErr w:type="spellEnd"/>
+      <w:r>
+        <w:t xml:space="preserve"> </w:t>
+      </w:r>
+      <w:proofErr w:type="spellStart"/>
+      <w:r>
+        <w:t>co-published</w:t>
+      </w:r>
+      <w:proofErr w:type="spellEnd"/>
+      <w:r>
+        <w:t xml:space="preserve"> </w:t>
+      </w:r>
+      <w:proofErr w:type="spellStart"/>
+      <w:r>
+        <w:t>by</w:t>
+      </w:r>
+      <w:proofErr w:type="spellEnd"/>
+      <w:r>
+        <w:t xml:space="preserve"> </w:t>
+      </w:r>
+      <w:proofErr w:type="spellStart"/>
+      <w:r>
+        <w:t>the</w:t>
       </w:r>
       <w:proofErr w:type="spellEnd"/>
       <w:r>
@@ -835,7 +835,7 @@
       </w:r>
       <w:proofErr w:type="spellStart"/>
       <w:r>
-        <w:t xml:space="preserve">with</w:t>
+        <w:t>with</w:t>
       </w:r>
       <w:proofErr w:type="spellEnd"/>
       <w:r>
@@ -843,15 +843,15 @@
       </w:r>
       <w:proofErr w:type="spellStart"/>
       <w:r>
-        <w:t xml:space="preserve">and</w:t>
-      </w:r>
-      <w:proofErr w:type="spellEnd"/>
-      <w:r>
-        <w:t xml:space="preserve"> </w:t>
-      </w:r>
-      <w:proofErr w:type="spellStart"/>
-      <w:r>
-        <w:t xml:space="preserve">the</w:t>
+        <w:t>and</w:t>
+      </w:r>
+      <w:proofErr w:type="spellEnd"/>
+      <w:r>
+        <w:t xml:space="preserve"> </w:t>
+      </w:r>
+      <w:proofErr w:type="spellStart"/>
+      <w:r>
+        <w:t>the</w:t>
       </w:r>
       <w:proofErr w:type="spellEnd"/>
       <w:r>

</xml_diff>